<commit_message>
feat: implement ATS Match Score & Keyword Gap Analyzer with HackerRank rubric, PDF/DOCX exports, and Neo-Brutalist UI
</commit_message>
<xml_diff>
--- a/project-docx/Job_Scout_Abstract.docx
+++ b/project-docx/Job_Scout_Abstract.docx
@@ -49,16 +49,7 @@
           <w:sz w:val="30"/>
           <w:szCs w:val="30"/>
         </w:rPr>
-        <w:t>Abs</w:t>
-      </w:r>
-      <w:r>
-        <w:rPr>
-          <w:rFonts w:ascii="Times New Roman" w:hAnsi="Times New Roman"/>
-          <w:b/>
-          <w:sz w:val="30"/>
-          <w:szCs w:val="30"/>
-        </w:rPr>
-        <w:t>tract</w:t>
+        <w:t>Abstract</w:t>
       </w:r>
     </w:p>
     <w:p>
@@ -123,6 +114,222 @@
           <w:rFonts w:ascii="Times New Roman" w:hAnsi="Times New Roman"/>
         </w:rPr>
         <w:t xml:space="preserve"> Retrieval-Augmented Generation, Resume Parsing, Artificial Intelligence, Job Matching, Vector Search.</w:t>
+      </w:r>
+      <w:r>
+        <w:br w:type="page"/>
+      </w:r>
+    </w:p>
+    <w:p>
+      <w:pPr>
+        <w:pStyle w:val="Normal"/>
+        <w:jc w:val="both"/>
+        <w:rPr>
+          <w:rFonts w:ascii="Times New Roman" w:hAnsi="Times New Roman"/>
+          <w:sz w:val="30"/>
+          <w:szCs w:val="30"/>
+        </w:rPr>
+      </w:pPr>
+      <w:r>
+        <w:rPr>
+          <w:b/>
+          <w:sz w:val="30"/>
+          <w:szCs w:val="30"/>
+        </w:rPr>
+        <w:t>Architecture Diagram</w:t>
+      </w:r>
+    </w:p>
+    <w:p>
+      <w:pPr>
+        <w:pStyle w:val="Normal"/>
+        <w:jc w:val="both"/>
+        <w:rPr>
+          <w:rFonts w:ascii="Times New Roman" w:hAnsi="Times New Roman"/>
+          <w:sz w:val="30"/>
+          <w:szCs w:val="30"/>
+        </w:rPr>
+      </w:pPr>
+      <w:r>
+        <w:rPr>
+          <w:b/>
+          <w:sz w:val="30"/>
+          <w:szCs w:val="30"/>
+        </w:rPr>
+      </w:r>
+    </w:p>
+    <w:p>
+      <w:pPr>
+        <w:pStyle w:val="Normal"/>
+        <w:jc w:val="both"/>
+        <w:rPr>
+          <w:rFonts w:ascii="Times New Roman" w:hAnsi="Times New Roman"/>
+          <w:sz w:val="30"/>
+          <w:szCs w:val="30"/>
+        </w:rPr>
+      </w:pPr>
+      <w:r>
+        <w:drawing>
+          <wp:anchor distT="0" distB="0" distL="0" distR="0" simplePos="0" relativeHeight="2" behindDoc="0" locked="0" layoutInCell="0" allowOverlap="1">
+            <wp:simplePos x="0" y="0"/>
+            <wp:positionH relativeFrom="column">
+              <wp:align>center</wp:align>
+            </wp:positionH>
+            <wp:positionV relativeFrom="paragraph">
+              <wp:posOffset>635</wp:posOffset>
+            </wp:positionV>
+            <wp:extent cx="5486400" cy="3061970"/>
+            <wp:effectExtent l="0" t="0" r="0" b="0"/>
+            <wp:wrapSquare wrapText="largest"/>
+            <wp:docPr id="1" name="Image1"/>
+            <wp:cNvGraphicFramePr>
+              <a:graphicFrameLocks xmlns:a="http://schemas.openxmlformats.org/drawingml/2006/main" noChangeAspect="1"/>
+            </wp:cNvGraphicFramePr>
+            <a:graphic xmlns:a="http://schemas.openxmlformats.org/drawingml/2006/main">
+              <a:graphicData uri="http://schemas.openxmlformats.org/drawingml/2006/picture">
+                <pic:pic xmlns:pic="http://schemas.openxmlformats.org/drawingml/2006/picture">
+                  <pic:nvPicPr>
+                    <pic:cNvPr id="1" name="Image1"/>
+                    <pic:cNvPicPr>
+                      <a:picLocks noChangeAspect="1" noChangeArrowheads="1"/>
+                    </pic:cNvPicPr>
+                  </pic:nvPicPr>
+                  <pic:blipFill>
+                    <a:blip r:embed="rId2"/>
+                    <a:stretch>
+                      <a:fillRect/>
+                    </a:stretch>
+                  </pic:blipFill>
+                  <pic:spPr bwMode="auto">
+                    <a:xfrm>
+                      <a:off x="0" y="0"/>
+                      <a:ext cx="5486400" cy="3061970"/>
+                    </a:xfrm>
+                    <a:prstGeom prst="rect">
+                      <a:avLst/>
+                    </a:prstGeom>
+                    <a:noFill/>
+                  </pic:spPr>
+                </pic:pic>
+              </a:graphicData>
+            </a:graphic>
+          </wp:anchor>
+        </w:drawing>
+      </w:r>
+      <w:r>
+        <w:rPr>
+          <w:b/>
+          <w:sz w:val="30"/>
+          <w:szCs w:val="30"/>
+        </w:rPr>
+        <w:t xml:space="preserve">  </w:t>
+      </w:r>
+    </w:p>
+    <w:p>
+      <w:pPr>
+        <w:pStyle w:val="Normal"/>
+        <w:jc w:val="both"/>
+        <w:rPr>
+          <w:rFonts w:ascii="Times New Roman" w:hAnsi="Times New Roman"/>
+          <w:sz w:val="30"/>
+          <w:szCs w:val="30"/>
+        </w:rPr>
+      </w:pPr>
+      <w:r>
+        <w:rPr>
+          <w:b/>
+          <w:sz w:val="30"/>
+          <w:szCs w:val="30"/>
+        </w:rPr>
+      </w:r>
+    </w:p>
+    <w:p>
+      <w:pPr>
+        <w:pStyle w:val="Normal"/>
+        <w:jc w:val="both"/>
+        <w:rPr>
+          <w:rFonts w:ascii="Times New Roman" w:hAnsi="Times New Roman"/>
+          <w:sz w:val="30"/>
+          <w:szCs w:val="30"/>
+        </w:rPr>
+      </w:pPr>
+      <w:r>
+        <w:rPr>
+          <w:b/>
+          <w:sz w:val="30"/>
+          <w:szCs w:val="30"/>
+        </w:rPr>
+      </w:r>
+    </w:p>
+    <w:p>
+      <w:pPr>
+        <w:pStyle w:val="Normal"/>
+        <w:jc w:val="both"/>
+        <w:rPr>
+          <w:rFonts w:ascii="Times New Roman" w:hAnsi="Times New Roman"/>
+          <w:sz w:val="30"/>
+          <w:szCs w:val="30"/>
+        </w:rPr>
+      </w:pPr>
+      <w:r>
+        <w:rPr>
+          <w:b/>
+          <w:sz w:val="30"/>
+          <w:szCs w:val="30"/>
+        </w:rPr>
+      </w:r>
+    </w:p>
+    <w:p>
+      <w:pPr>
+        <w:pStyle w:val="Normal"/>
+        <w:jc w:val="both"/>
+        <w:rPr>
+          <w:rFonts w:ascii="Times New Roman" w:hAnsi="Times New Roman"/>
+          <w:sz w:val="30"/>
+          <w:szCs w:val="30"/>
+        </w:rPr>
+      </w:pPr>
+      <w:r>
+        <w:rPr>
+          <w:b/>
+          <w:sz w:val="30"/>
+          <w:szCs w:val="30"/>
+        </w:rPr>
+      </w:r>
+    </w:p>
+    <w:p>
+      <w:pPr>
+        <w:pStyle w:val="Normal"/>
+        <w:jc w:val="both"/>
+        <w:rPr>
+          <w:rFonts w:ascii="Times New Roman" w:hAnsi="Times New Roman"/>
+          <w:sz w:val="30"/>
+          <w:szCs w:val="30"/>
+        </w:rPr>
+      </w:pPr>
+      <w:r>
+        <w:rPr>
+          <w:b/>
+          <w:sz w:val="30"/>
+          <w:szCs w:val="30"/>
+        </w:rPr>
+      </w:r>
+    </w:p>
+    <w:p>
+      <w:pPr>
+        <w:pStyle w:val="Normal"/>
+        <w:spacing w:before="0" w:after="200"/>
+        <w:jc w:val="both"/>
+        <w:rPr>
+          <w:rFonts w:ascii="Times New Roman" w:hAnsi="Times New Roman"/>
+          <w:sz w:val="30"/>
+          <w:szCs w:val="30"/>
+        </w:rPr>
+      </w:pPr>
+      <w:r>
+        <w:rPr>
+          <w:b/>
+          <w:sz w:val="30"/>
+          <w:szCs w:val="30"/>
+        </w:rPr>
       </w:r>
     </w:p>
     <w:sectPr>
@@ -167,6 +374,7 @@
         </w:tabs>
         <w:ind w:start="1080" w:hanging="360"/>
       </w:pPr>
+      <w:rPr/>
     </w:lvl>
     <w:lvl w:ilvl="2">
       <w:start w:val="1"/>
@@ -179,6 +387,7 @@
         </w:tabs>
         <w:ind w:start="1440" w:hanging="360"/>
       </w:pPr>
+      <w:rPr/>
     </w:lvl>
     <w:lvl w:ilvl="3">
       <w:start w:val="1"/>
@@ -191,6 +400,7 @@
         </w:tabs>
         <w:ind w:start="1800" w:hanging="360"/>
       </w:pPr>
+      <w:rPr/>
     </w:lvl>
     <w:lvl w:ilvl="4">
       <w:start w:val="1"/>
@@ -203,6 +413,7 @@
         </w:tabs>
         <w:ind w:start="2160" w:hanging="360"/>
       </w:pPr>
+      <w:rPr/>
     </w:lvl>
     <w:lvl w:ilvl="5">
       <w:start w:val="1"/>
@@ -215,6 +426,7 @@
         </w:tabs>
         <w:ind w:start="2520" w:hanging="360"/>
       </w:pPr>
+      <w:rPr/>
     </w:lvl>
     <w:lvl w:ilvl="6">
       <w:start w:val="1"/>
@@ -227,6 +439,7 @@
         </w:tabs>
         <w:ind w:start="2880" w:hanging="360"/>
       </w:pPr>
+      <w:rPr/>
     </w:lvl>
     <w:lvl w:ilvl="7">
       <w:start w:val="1"/>
@@ -239,6 +452,7 @@
         </w:tabs>
         <w:ind w:start="3240" w:hanging="360"/>
       </w:pPr>
+      <w:rPr/>
     </w:lvl>
     <w:lvl w:ilvl="8">
       <w:start w:val="1"/>
@@ -251,6 +465,7 @@
         </w:tabs>
         <w:ind w:start="3600" w:hanging="360"/>
       </w:pPr>
+      <w:rPr/>
     </w:lvl>
   </w:abstractNum>
   <w:abstractNum w:abstractNumId="2">
@@ -280,6 +495,7 @@
         </w:tabs>
         <w:ind w:start="1080" w:hanging="360"/>
       </w:pPr>
+      <w:rPr/>
     </w:lvl>
     <w:lvl w:ilvl="2">
       <w:start w:val="1"/>
@@ -292,6 +508,7 @@
         </w:tabs>
         <w:ind w:start="1440" w:hanging="360"/>
       </w:pPr>
+      <w:rPr/>
     </w:lvl>
     <w:lvl w:ilvl="3">
       <w:start w:val="1"/>
@@ -304,6 +521,7 @@
         </w:tabs>
         <w:ind w:start="1800" w:hanging="360"/>
       </w:pPr>
+      <w:rPr/>
     </w:lvl>
     <w:lvl w:ilvl="4">
       <w:start w:val="1"/>
@@ -316,6 +534,7 @@
         </w:tabs>
         <w:ind w:start="2160" w:hanging="360"/>
       </w:pPr>
+      <w:rPr/>
     </w:lvl>
     <w:lvl w:ilvl="5">
       <w:start w:val="1"/>
@@ -328,6 +547,7 @@
         </w:tabs>
         <w:ind w:start="2520" w:hanging="360"/>
       </w:pPr>
+      <w:rPr/>
     </w:lvl>
     <w:lvl w:ilvl="6">
       <w:start w:val="1"/>
@@ -340,6 +560,7 @@
         </w:tabs>
         <w:ind w:start="2880" w:hanging="360"/>
       </w:pPr>
+      <w:rPr/>
     </w:lvl>
     <w:lvl w:ilvl="7">
       <w:start w:val="1"/>
@@ -352,6 +573,7 @@
         </w:tabs>
         <w:ind w:start="3240" w:hanging="360"/>
       </w:pPr>
+      <w:rPr/>
     </w:lvl>
     <w:lvl w:ilvl="8">
       <w:start w:val="1"/>
@@ -364,6 +586,7 @@
         </w:tabs>
         <w:ind w:start="3600" w:hanging="360"/>
       </w:pPr>
+      <w:rPr/>
     </w:lvl>
   </w:abstractNum>
   <w:abstractNum w:abstractNumId="3">
@@ -393,6 +616,7 @@
         </w:tabs>
         <w:ind w:start="1080" w:hanging="360"/>
       </w:pPr>
+      <w:rPr/>
     </w:lvl>
     <w:lvl w:ilvl="2">
       <w:start w:val="1"/>
@@ -405,6 +629,7 @@
         </w:tabs>
         <w:ind w:start="1440" w:hanging="360"/>
       </w:pPr>
+      <w:rPr/>
     </w:lvl>
     <w:lvl w:ilvl="3">
       <w:start w:val="1"/>
@@ -417,6 +642,7 @@
         </w:tabs>
         <w:ind w:start="1800" w:hanging="360"/>
       </w:pPr>
+      <w:rPr/>
     </w:lvl>
     <w:lvl w:ilvl="4">
       <w:start w:val="1"/>
@@ -429,6 +655,7 @@
         </w:tabs>
         <w:ind w:start="2160" w:hanging="360"/>
       </w:pPr>
+      <w:rPr/>
     </w:lvl>
     <w:lvl w:ilvl="5">
       <w:start w:val="1"/>
@@ -441,6 +668,7 @@
         </w:tabs>
         <w:ind w:start="2520" w:hanging="360"/>
       </w:pPr>
+      <w:rPr/>
     </w:lvl>
     <w:lvl w:ilvl="6">
       <w:start w:val="1"/>
@@ -453,6 +681,7 @@
         </w:tabs>
         <w:ind w:start="2880" w:hanging="360"/>
       </w:pPr>
+      <w:rPr/>
     </w:lvl>
     <w:lvl w:ilvl="7">
       <w:start w:val="1"/>
@@ -465,6 +694,7 @@
         </w:tabs>
         <w:ind w:start="3240" w:hanging="360"/>
       </w:pPr>
+      <w:rPr/>
     </w:lvl>
     <w:lvl w:ilvl="8">
       <w:start w:val="1"/>
@@ -477,6 +707,7 @@
         </w:tabs>
         <w:ind w:start="3600" w:hanging="360"/>
       </w:pPr>
+      <w:rPr/>
     </w:lvl>
   </w:abstractNum>
   <w:abstractNum w:abstractNumId="4">
@@ -504,6 +735,7 @@
         </w:tabs>
         <w:ind w:start="1080" w:hanging="360"/>
       </w:pPr>
+      <w:rPr/>
     </w:lvl>
     <w:lvl w:ilvl="2">
       <w:start w:val="1"/>
@@ -516,6 +748,7 @@
         </w:tabs>
         <w:ind w:start="1440" w:hanging="360"/>
       </w:pPr>
+      <w:rPr/>
     </w:lvl>
     <w:lvl w:ilvl="3">
       <w:start w:val="1"/>
@@ -528,6 +761,7 @@
         </w:tabs>
         <w:ind w:start="1800" w:hanging="360"/>
       </w:pPr>
+      <w:rPr/>
     </w:lvl>
     <w:lvl w:ilvl="4">
       <w:start w:val="1"/>
@@ -540,6 +774,7 @@
         </w:tabs>
         <w:ind w:start="2160" w:hanging="360"/>
       </w:pPr>
+      <w:rPr/>
     </w:lvl>
     <w:lvl w:ilvl="5">
       <w:start w:val="1"/>
@@ -552,6 +787,7 @@
         </w:tabs>
         <w:ind w:start="2520" w:hanging="360"/>
       </w:pPr>
+      <w:rPr/>
     </w:lvl>
     <w:lvl w:ilvl="6">
       <w:start w:val="1"/>
@@ -564,6 +800,7 @@
         </w:tabs>
         <w:ind w:start="2880" w:hanging="360"/>
       </w:pPr>
+      <w:rPr/>
     </w:lvl>
     <w:lvl w:ilvl="7">
       <w:start w:val="1"/>
@@ -576,6 +813,7 @@
         </w:tabs>
         <w:ind w:start="3240" w:hanging="360"/>
       </w:pPr>
+      <w:rPr/>
     </w:lvl>
     <w:lvl w:ilvl="8">
       <w:start w:val="1"/>
@@ -588,6 +826,7 @@
         </w:tabs>
         <w:ind w:start="3600" w:hanging="360"/>
       </w:pPr>
+      <w:rPr/>
     </w:lvl>
   </w:abstractNum>
   <w:abstractNum w:abstractNumId="5">
@@ -615,6 +854,7 @@
         </w:tabs>
         <w:ind w:start="1080" w:hanging="360"/>
       </w:pPr>
+      <w:rPr/>
     </w:lvl>
     <w:lvl w:ilvl="2">
       <w:start w:val="1"/>
@@ -627,6 +867,7 @@
         </w:tabs>
         <w:ind w:start="1440" w:hanging="360"/>
       </w:pPr>
+      <w:rPr/>
     </w:lvl>
     <w:lvl w:ilvl="3">
       <w:start w:val="1"/>
@@ -639,6 +880,7 @@
         </w:tabs>
         <w:ind w:start="1800" w:hanging="360"/>
       </w:pPr>
+      <w:rPr/>
     </w:lvl>
     <w:lvl w:ilvl="4">
       <w:start w:val="1"/>
@@ -651,6 +893,7 @@
         </w:tabs>
         <w:ind w:start="2160" w:hanging="360"/>
       </w:pPr>
+      <w:rPr/>
     </w:lvl>
     <w:lvl w:ilvl="5">
       <w:start w:val="1"/>
@@ -663,6 +906,7 @@
         </w:tabs>
         <w:ind w:start="2520" w:hanging="360"/>
       </w:pPr>
+      <w:rPr/>
     </w:lvl>
     <w:lvl w:ilvl="6">
       <w:start w:val="1"/>
@@ -675,6 +919,7 @@
         </w:tabs>
         <w:ind w:start="2880" w:hanging="360"/>
       </w:pPr>
+      <w:rPr/>
     </w:lvl>
     <w:lvl w:ilvl="7">
       <w:start w:val="1"/>
@@ -687,6 +932,7 @@
         </w:tabs>
         <w:ind w:start="3240" w:hanging="360"/>
       </w:pPr>
+      <w:rPr/>
     </w:lvl>
     <w:lvl w:ilvl="8">
       <w:start w:val="1"/>
@@ -699,6 +945,7 @@
         </w:tabs>
         <w:ind w:start="3600" w:hanging="360"/>
       </w:pPr>
+      <w:rPr/>
     </w:lvl>
   </w:abstractNum>
   <w:abstractNum w:abstractNumId="6">
@@ -726,6 +973,7 @@
         </w:tabs>
         <w:ind w:start="1080" w:hanging="360"/>
       </w:pPr>
+      <w:rPr/>
     </w:lvl>
     <w:lvl w:ilvl="2">
       <w:start w:val="1"/>
@@ -738,6 +986,7 @@
         </w:tabs>
         <w:ind w:start="1440" w:hanging="360"/>
       </w:pPr>
+      <w:rPr/>
     </w:lvl>
     <w:lvl w:ilvl="3">
       <w:start w:val="1"/>
@@ -750,6 +999,7 @@
         </w:tabs>
         <w:ind w:start="1800" w:hanging="360"/>
       </w:pPr>
+      <w:rPr/>
     </w:lvl>
     <w:lvl w:ilvl="4">
       <w:start w:val="1"/>
@@ -762,6 +1012,7 @@
         </w:tabs>
         <w:ind w:start="2160" w:hanging="360"/>
       </w:pPr>
+      <w:rPr/>
     </w:lvl>
     <w:lvl w:ilvl="5">
       <w:start w:val="1"/>
@@ -774,6 +1025,7 @@
         </w:tabs>
         <w:ind w:start="2520" w:hanging="360"/>
       </w:pPr>
+      <w:rPr/>
     </w:lvl>
     <w:lvl w:ilvl="6">
       <w:start w:val="1"/>
@@ -786,6 +1038,7 @@
         </w:tabs>
         <w:ind w:start="2880" w:hanging="360"/>
       </w:pPr>
+      <w:rPr/>
     </w:lvl>
     <w:lvl w:ilvl="7">
       <w:start w:val="1"/>
@@ -798,6 +1051,7 @@
         </w:tabs>
         <w:ind w:start="3240" w:hanging="360"/>
       </w:pPr>
+      <w:rPr/>
     </w:lvl>
     <w:lvl w:ilvl="8">
       <w:start w:val="1"/>
@@ -810,6 +1064,7 @@
         </w:tabs>
         <w:ind w:start="3600" w:hanging="360"/>
       </w:pPr>
+      <w:rPr/>
     </w:lvl>
   </w:abstractNum>
   <w:abstractNum w:abstractNumId="7">
@@ -960,7 +1215,7 @@
   <w:docDefaults>
     <w:rPrDefault>
       <w:rPr>
-        <w:rFonts w:ascii="Cambria" w:hAnsi="Cambria" w:eastAsia="ＭＳ 明朝" w:cs="" w:asciiTheme="minorHAnsi" w:cstheme="minorBidi" w:eastAsiaTheme="minorEastAsia" w:hAnsiTheme="minorHAnsi"/>
+        <w:rFonts w:ascii="Cambria" w:hAnsi="Cambria" w:eastAsia="" w:cs="" w:asciiTheme="minorHAnsi" w:cstheme="minorBidi" w:eastAsiaTheme="minorEastAsia" w:hAnsiTheme="minorHAnsi"/>
         <w:sz w:val="22"/>
         <w:szCs w:val="22"/>
         <w:lang w:val="en-US" w:eastAsia="en-US" w:bidi="ar-SA"/>
@@ -1117,12 +1372,13 @@
     <w:rsid w:val="00fc693f"/>
     <w:pPr>
       <w:widowControl/>
+      <w:suppressAutoHyphens w:val="true"/>
       <w:bidi w:val="0"/>
       <w:spacing w:lineRule="auto" w:line="276" w:before="0" w:after="200"/>
       <w:jc w:val="start"/>
     </w:pPr>
     <w:rPr>
-      <w:rFonts w:ascii="Cambria" w:hAnsi="Cambria" w:eastAsia="ＭＳ 明朝" w:cs="" w:asciiTheme="minorHAnsi" w:cstheme="minorBidi" w:eastAsiaTheme="minorEastAsia" w:hAnsiTheme="minorHAnsi"/>
+      <w:rFonts w:ascii="Cambria" w:hAnsi="Cambria" w:eastAsia="" w:cs="" w:asciiTheme="minorHAnsi" w:cstheme="minorBidi" w:eastAsiaTheme="minorEastAsia" w:hAnsiTheme="minorHAnsi"/>
       <w:color w:val="auto"/>
       <w:kern w:val="0"/>
       <w:sz w:val="22"/>
@@ -1145,7 +1401,7 @@
       <w:outlineLvl w:val="0"/>
     </w:pPr>
     <w:rPr>
-      <w:rFonts w:ascii="Calibri" w:hAnsi="Calibri" w:eastAsia="ＭＳ ゴシック" w:cs="" w:asciiTheme="majorHAnsi" w:cstheme="majorBidi" w:eastAsiaTheme="majorEastAsia" w:hAnsiTheme="majorHAnsi"/>
+      <w:rFonts w:ascii="Calibri" w:hAnsi="Calibri" w:eastAsia="" w:cs="" w:asciiTheme="majorHAnsi" w:cstheme="majorBidi" w:eastAsiaTheme="majorEastAsia" w:hAnsiTheme="majorHAnsi"/>
       <w:b/>
       <w:bCs/>
       <w:color w:themeColor="accent1" w:themeShade="bf" w:val="365F91"/>
@@ -1169,7 +1425,7 @@
       <w:outlineLvl w:val="1"/>
     </w:pPr>
     <w:rPr>
-      <w:rFonts w:ascii="Calibri" w:hAnsi="Calibri" w:eastAsia="ＭＳ ゴシック" w:cs="" w:asciiTheme="majorHAnsi" w:cstheme="majorBidi" w:eastAsiaTheme="majorEastAsia" w:hAnsiTheme="majorHAnsi"/>
+      <w:rFonts w:ascii="Calibri" w:hAnsi="Calibri" w:eastAsia="" w:cs="" w:asciiTheme="majorHAnsi" w:cstheme="majorBidi" w:eastAsiaTheme="majorEastAsia" w:hAnsiTheme="majorHAnsi"/>
       <w:b/>
       <w:bCs/>
       <w:color w:themeColor="accent1" w:val="4F81BD"/>
@@ -1193,7 +1449,7 @@
       <w:outlineLvl w:val="2"/>
     </w:pPr>
     <w:rPr>
-      <w:rFonts w:ascii="Calibri" w:hAnsi="Calibri" w:eastAsia="ＭＳ ゴシック" w:cs="" w:asciiTheme="majorHAnsi" w:cstheme="majorBidi" w:eastAsiaTheme="majorEastAsia" w:hAnsiTheme="majorHAnsi"/>
+      <w:rFonts w:ascii="Calibri" w:hAnsi="Calibri" w:eastAsia="" w:cs="" w:asciiTheme="majorHAnsi" w:cstheme="majorBidi" w:eastAsiaTheme="majorEastAsia" w:hAnsiTheme="majorHAnsi"/>
       <w:b/>
       <w:bCs/>
       <w:color w:themeColor="accent1" w:val="4F81BD"/>
@@ -1216,7 +1472,7 @@
       <w:outlineLvl w:val="3"/>
     </w:pPr>
     <w:rPr>
-      <w:rFonts w:ascii="Calibri" w:hAnsi="Calibri" w:eastAsia="ＭＳ ゴシック" w:cs="" w:asciiTheme="majorHAnsi" w:cstheme="majorBidi" w:eastAsiaTheme="majorEastAsia" w:hAnsiTheme="majorHAnsi"/>
+      <w:rFonts w:ascii="Calibri" w:hAnsi="Calibri" w:eastAsia="" w:cs="" w:asciiTheme="majorHAnsi" w:cstheme="majorBidi" w:eastAsiaTheme="majorEastAsia" w:hAnsiTheme="majorHAnsi"/>
       <w:b/>
       <w:bCs/>
       <w:i/>
@@ -1241,7 +1497,7 @@
       <w:outlineLvl w:val="4"/>
     </w:pPr>
     <w:rPr>
-      <w:rFonts w:ascii="Calibri" w:hAnsi="Calibri" w:eastAsia="ＭＳ ゴシック" w:cs="" w:asciiTheme="majorHAnsi" w:cstheme="majorBidi" w:eastAsiaTheme="majorEastAsia" w:hAnsiTheme="majorHAnsi"/>
+      <w:rFonts w:ascii="Calibri" w:hAnsi="Calibri" w:eastAsia="" w:cs="" w:asciiTheme="majorHAnsi" w:cstheme="majorBidi" w:eastAsiaTheme="majorEastAsia" w:hAnsiTheme="majorHAnsi"/>
       <w:color w:themeColor="accent1" w:themeShade="7f" w:val="243F60"/>
     </w:rPr>
   </w:style>
@@ -1262,7 +1518,7 @@
       <w:outlineLvl w:val="5"/>
     </w:pPr>
     <w:rPr>
-      <w:rFonts w:ascii="Calibri" w:hAnsi="Calibri" w:eastAsia="ＭＳ ゴシック" w:cs="" w:asciiTheme="majorHAnsi" w:cstheme="majorBidi" w:eastAsiaTheme="majorEastAsia" w:hAnsiTheme="majorHAnsi"/>
+      <w:rFonts w:ascii="Calibri" w:hAnsi="Calibri" w:eastAsia="" w:cs="" w:asciiTheme="majorHAnsi" w:cstheme="majorBidi" w:eastAsiaTheme="majorEastAsia" w:hAnsiTheme="majorHAnsi"/>
       <w:i/>
       <w:iCs/>
       <w:color w:themeColor="accent1" w:themeShade="7f" w:val="243F60"/>
@@ -1285,7 +1541,7 @@
       <w:outlineLvl w:val="6"/>
     </w:pPr>
     <w:rPr>
-      <w:rFonts w:ascii="Calibri" w:hAnsi="Calibri" w:eastAsia="ＭＳ ゴシック" w:cs="" w:asciiTheme="majorHAnsi" w:cstheme="majorBidi" w:eastAsiaTheme="majorEastAsia" w:hAnsiTheme="majorHAnsi"/>
+      <w:rFonts w:ascii="Calibri" w:hAnsi="Calibri" w:eastAsia="" w:cs="" w:asciiTheme="majorHAnsi" w:cstheme="majorBidi" w:eastAsiaTheme="majorEastAsia" w:hAnsiTheme="majorHAnsi"/>
       <w:i/>
       <w:iCs/>
       <w:color w:themeColor="text1" w:themeTint="bf" w:val="404040"/>
@@ -1308,7 +1564,7 @@
       <w:outlineLvl w:val="7"/>
     </w:pPr>
     <w:rPr>
-      <w:rFonts w:ascii="Calibri" w:hAnsi="Calibri" w:eastAsia="ＭＳ ゴシック" w:cs="" w:asciiTheme="majorHAnsi" w:cstheme="majorBidi" w:eastAsiaTheme="majorEastAsia" w:hAnsiTheme="majorHAnsi"/>
+      <w:rFonts w:ascii="Calibri" w:hAnsi="Calibri" w:eastAsia="" w:cs="" w:asciiTheme="majorHAnsi" w:cstheme="majorBidi" w:eastAsiaTheme="majorEastAsia" w:hAnsiTheme="majorHAnsi"/>
       <w:color w:themeColor="accent1" w:val="4F81BD"/>
       <w:sz w:val="20"/>
       <w:szCs w:val="20"/>
@@ -1331,7 +1587,7 @@
       <w:outlineLvl w:val="8"/>
     </w:pPr>
     <w:rPr>
-      <w:rFonts w:ascii="Calibri" w:hAnsi="Calibri" w:eastAsia="ＭＳ ゴシック" w:cs="" w:asciiTheme="majorHAnsi" w:cstheme="majorBidi" w:eastAsiaTheme="majorEastAsia" w:hAnsiTheme="majorHAnsi"/>
+      <w:rFonts w:ascii="Calibri" w:hAnsi="Calibri" w:eastAsia="" w:cs="" w:asciiTheme="majorHAnsi" w:cstheme="majorBidi" w:eastAsiaTheme="majorEastAsia" w:hAnsiTheme="majorHAnsi"/>
       <w:i/>
       <w:iCs/>
       <w:color w:themeColor="text1" w:themeTint="bf" w:val="404040"/>
@@ -1373,7 +1629,7 @@
     <w:qFormat/>
     <w:rsid w:val="00fc693f"/>
     <w:rPr>
-      <w:rFonts w:ascii="Calibri" w:hAnsi="Calibri" w:eastAsia="ＭＳ ゴシック" w:cs="" w:asciiTheme="majorHAnsi" w:cstheme="majorBidi" w:eastAsiaTheme="majorEastAsia" w:hAnsiTheme="majorHAnsi"/>
+      <w:rFonts w:ascii="Calibri" w:hAnsi="Calibri" w:eastAsia="" w:cs="" w:asciiTheme="majorHAnsi" w:cstheme="majorBidi" w:eastAsiaTheme="majorEastAsia" w:hAnsiTheme="majorHAnsi"/>
       <w:b/>
       <w:bCs/>
       <w:color w:themeColor="accent1" w:themeShade="bf" w:val="365F91"/>
@@ -1389,7 +1645,7 @@
     <w:qFormat/>
     <w:rsid w:val="00fc693f"/>
     <w:rPr>
-      <w:rFonts w:ascii="Calibri" w:hAnsi="Calibri" w:eastAsia="ＭＳ ゴシック" w:cs="" w:asciiTheme="majorHAnsi" w:cstheme="majorBidi" w:eastAsiaTheme="majorEastAsia" w:hAnsiTheme="majorHAnsi"/>
+      <w:rFonts w:ascii="Calibri" w:hAnsi="Calibri" w:eastAsia="" w:cs="" w:asciiTheme="majorHAnsi" w:cstheme="majorBidi" w:eastAsiaTheme="majorEastAsia" w:hAnsiTheme="majorHAnsi"/>
       <w:b/>
       <w:bCs/>
       <w:color w:themeColor="accent1" w:val="4F81BD"/>
@@ -1405,7 +1661,7 @@
     <w:qFormat/>
     <w:rsid w:val="00fc693f"/>
     <w:rPr>
-      <w:rFonts w:ascii="Calibri" w:hAnsi="Calibri" w:eastAsia="ＭＳ ゴシック" w:cs="" w:asciiTheme="majorHAnsi" w:cstheme="majorBidi" w:eastAsiaTheme="majorEastAsia" w:hAnsiTheme="majorHAnsi"/>
+      <w:rFonts w:ascii="Calibri" w:hAnsi="Calibri" w:eastAsia="" w:cs="" w:asciiTheme="majorHAnsi" w:cstheme="majorBidi" w:eastAsiaTheme="majorEastAsia" w:hAnsiTheme="majorHAnsi"/>
       <w:b/>
       <w:bCs/>
       <w:color w:themeColor="accent1" w:val="4F81BD"/>
@@ -1419,7 +1675,7 @@
     <w:qFormat/>
     <w:rsid w:val="00fc693f"/>
     <w:rPr>
-      <w:rFonts w:ascii="Calibri" w:hAnsi="Calibri" w:eastAsia="ＭＳ ゴシック" w:cs="" w:asciiTheme="majorHAnsi" w:cstheme="majorBidi" w:eastAsiaTheme="majorEastAsia" w:hAnsiTheme="majorHAnsi"/>
+      <w:rFonts w:ascii="Calibri" w:hAnsi="Calibri" w:eastAsia="" w:cs="" w:asciiTheme="majorHAnsi" w:cstheme="majorBidi" w:eastAsiaTheme="majorEastAsia" w:hAnsiTheme="majorHAnsi"/>
       <w:color w:themeColor="text2" w:themeShade="bf" w:val="17365D"/>
       <w:spacing w:val="5"/>
       <w:kern w:val="2"/>
@@ -1435,7 +1691,7 @@
     <w:qFormat/>
     <w:rsid w:val="00fc693f"/>
     <w:rPr>
-      <w:rFonts w:ascii="Calibri" w:hAnsi="Calibri" w:eastAsia="ＭＳ ゴシック" w:cs="" w:asciiTheme="majorHAnsi" w:cstheme="majorBidi" w:eastAsiaTheme="majorEastAsia" w:hAnsiTheme="majorHAnsi"/>
+      <w:rFonts w:ascii="Calibri" w:hAnsi="Calibri" w:eastAsia="" w:cs="" w:asciiTheme="majorHAnsi" w:cstheme="majorBidi" w:eastAsiaTheme="majorEastAsia" w:hAnsiTheme="majorHAnsi"/>
       <w:i/>
       <w:iCs/>
       <w:color w:themeColor="accent1" w:val="4F81BD"/>
@@ -1508,7 +1764,7 @@
     <w:qFormat/>
     <w:rsid w:val="00fc693f"/>
     <w:rPr>
-      <w:rFonts w:ascii="Calibri" w:hAnsi="Calibri" w:eastAsia="ＭＳ ゴシック" w:cs="" w:asciiTheme="majorHAnsi" w:cstheme="majorBidi" w:eastAsiaTheme="majorEastAsia" w:hAnsiTheme="majorHAnsi"/>
+      <w:rFonts w:ascii="Calibri" w:hAnsi="Calibri" w:eastAsia="" w:cs="" w:asciiTheme="majorHAnsi" w:cstheme="majorBidi" w:eastAsiaTheme="majorEastAsia" w:hAnsiTheme="majorHAnsi"/>
       <w:b/>
       <w:bCs/>
       <w:i/>
@@ -1525,7 +1781,7 @@
     <w:qFormat/>
     <w:rsid w:val="00fc693f"/>
     <w:rPr>
-      <w:rFonts w:ascii="Calibri" w:hAnsi="Calibri" w:eastAsia="ＭＳ ゴシック" w:cs="" w:asciiTheme="majorHAnsi" w:cstheme="majorBidi" w:eastAsiaTheme="majorEastAsia" w:hAnsiTheme="majorHAnsi"/>
+      <w:rFonts w:ascii="Calibri" w:hAnsi="Calibri" w:eastAsia="" w:cs="" w:asciiTheme="majorHAnsi" w:cstheme="majorBidi" w:eastAsiaTheme="majorEastAsia" w:hAnsiTheme="majorHAnsi"/>
       <w:color w:themeColor="accent1" w:themeShade="7f" w:val="243F60"/>
     </w:rPr>
   </w:style>
@@ -1538,7 +1794,7 @@
     <w:qFormat/>
     <w:rsid w:val="00fc693f"/>
     <w:rPr>
-      <w:rFonts w:ascii="Calibri" w:hAnsi="Calibri" w:eastAsia="ＭＳ ゴシック" w:cs="" w:asciiTheme="majorHAnsi" w:cstheme="majorBidi" w:eastAsiaTheme="majorEastAsia" w:hAnsiTheme="majorHAnsi"/>
+      <w:rFonts w:ascii="Calibri" w:hAnsi="Calibri" w:eastAsia="" w:cs="" w:asciiTheme="majorHAnsi" w:cstheme="majorBidi" w:eastAsiaTheme="majorEastAsia" w:hAnsiTheme="majorHAnsi"/>
       <w:i/>
       <w:iCs/>
       <w:color w:themeColor="accent1" w:themeShade="7f" w:val="243F60"/>
@@ -1553,7 +1809,7 @@
     <w:qFormat/>
     <w:rsid w:val="00fc693f"/>
     <w:rPr>
-      <w:rFonts w:ascii="Calibri" w:hAnsi="Calibri" w:eastAsia="ＭＳ ゴシック" w:cs="" w:asciiTheme="majorHAnsi" w:cstheme="majorBidi" w:eastAsiaTheme="majorEastAsia" w:hAnsiTheme="majorHAnsi"/>
+      <w:rFonts w:ascii="Calibri" w:hAnsi="Calibri" w:eastAsia="" w:cs="" w:asciiTheme="majorHAnsi" w:cstheme="majorBidi" w:eastAsiaTheme="majorEastAsia" w:hAnsiTheme="majorHAnsi"/>
       <w:i/>
       <w:iCs/>
       <w:color w:themeColor="text1" w:themeTint="bf" w:val="404040"/>
@@ -1568,7 +1824,7 @@
     <w:qFormat/>
     <w:rsid w:val="00fc693f"/>
     <w:rPr>
-      <w:rFonts w:ascii="Calibri" w:hAnsi="Calibri" w:eastAsia="ＭＳ ゴシック" w:cs="" w:asciiTheme="majorHAnsi" w:cstheme="majorBidi" w:eastAsiaTheme="majorEastAsia" w:hAnsiTheme="majorHAnsi"/>
+      <w:rFonts w:ascii="Calibri" w:hAnsi="Calibri" w:eastAsia="" w:cs="" w:asciiTheme="majorHAnsi" w:cstheme="majorBidi" w:eastAsiaTheme="majorEastAsia" w:hAnsiTheme="majorHAnsi"/>
       <w:color w:themeColor="accent1" w:val="4F81BD"/>
       <w:sz w:val="20"/>
       <w:szCs w:val="20"/>
@@ -1583,7 +1839,7 @@
     <w:qFormat/>
     <w:rsid w:val="00fc693f"/>
     <w:rPr>
-      <w:rFonts w:ascii="Calibri" w:hAnsi="Calibri" w:eastAsia="ＭＳ ゴシック" w:cs="" w:asciiTheme="majorHAnsi" w:cstheme="majorBidi" w:eastAsiaTheme="majorEastAsia" w:hAnsiTheme="majorHAnsi"/>
+      <w:rFonts w:ascii="Calibri" w:hAnsi="Calibri" w:eastAsia="" w:cs="" w:asciiTheme="majorHAnsi" w:cstheme="majorBidi" w:eastAsiaTheme="majorEastAsia" w:hAnsiTheme="majorHAnsi"/>
       <w:i/>
       <w:iCs/>
       <w:color w:themeColor="text1" w:themeTint="bf" w:val="404040"/>
@@ -1813,12 +2069,13 @@
     <w:rsid w:val="00fc693f"/>
     <w:pPr>
       <w:widowControl/>
+      <w:suppressAutoHyphens w:val="true"/>
       <w:bidi w:val="0"/>
       <w:spacing w:lineRule="auto" w:line="240" w:before="0" w:after="0"/>
       <w:jc w:val="start"/>
     </w:pPr>
     <w:rPr>
-      <w:rFonts w:ascii="Cambria" w:hAnsi="Cambria" w:eastAsia="ＭＳ 明朝" w:cs="" w:asciiTheme="minorHAnsi" w:cstheme="minorBidi" w:eastAsiaTheme="minorEastAsia" w:hAnsiTheme="minorHAnsi"/>
+      <w:rFonts w:ascii="Cambria" w:hAnsi="Cambria" w:eastAsia="" w:cs="" w:asciiTheme="minorHAnsi" w:cstheme="minorBidi" w:eastAsiaTheme="minorEastAsia" w:hAnsiTheme="minorHAnsi"/>
       <w:color w:val="auto"/>
       <w:kern w:val="0"/>
       <w:sz w:val="22"/>
@@ -1842,7 +2099,7 @@
       <w:contextualSpacing/>
     </w:pPr>
     <w:rPr>
-      <w:rFonts w:ascii="Calibri" w:hAnsi="Calibri" w:eastAsia="ＭＳ ゴシック" w:cs="" w:asciiTheme="majorHAnsi" w:cstheme="majorBidi" w:eastAsiaTheme="majorEastAsia" w:hAnsiTheme="majorHAnsi"/>
+      <w:rFonts w:ascii="Calibri" w:hAnsi="Calibri" w:eastAsia="" w:cs="" w:asciiTheme="majorHAnsi" w:cstheme="majorBidi" w:eastAsiaTheme="majorEastAsia" w:hAnsiTheme="majorHAnsi"/>
       <w:color w:themeColor="text2" w:themeShade="bf" w:val="17365D"/>
       <w:spacing w:val="5"/>
       <w:kern w:val="2"/>
@@ -1860,7 +2117,7 @@
     <w:rsid w:val="00fc693f"/>
     <w:pPr/>
     <w:rPr>
-      <w:rFonts w:ascii="Calibri" w:hAnsi="Calibri" w:eastAsia="ＭＳ ゴシック" w:cs="" w:asciiTheme="majorHAnsi" w:cstheme="majorBidi" w:eastAsiaTheme="majorEastAsia" w:hAnsiTheme="majorHAnsi"/>
+      <w:rFonts w:ascii="Calibri" w:hAnsi="Calibri" w:eastAsia="" w:cs="" w:asciiTheme="majorHAnsi" w:cstheme="majorBidi" w:eastAsiaTheme="majorEastAsia" w:hAnsiTheme="majorHAnsi"/>
       <w:i/>
       <w:iCs/>
       <w:color w:themeColor="accent1" w:val="4F81BD"/>
@@ -2093,12 +2350,13 @@
         <w:tab w:val="left" w:pos="3456" w:leader="none"/>
         <w:tab w:val="left" w:pos="4032" w:leader="none"/>
       </w:tabs>
+      <w:suppressAutoHyphens w:val="true"/>
       <w:bidi w:val="0"/>
       <w:spacing w:lineRule="auto" w:line="276" w:before="0" w:after="200"/>
       <w:jc w:val="start"/>
     </w:pPr>
     <w:rPr>
-      <w:rFonts w:ascii="Courier" w:hAnsi="Courier" w:eastAsia="ＭＳ 明朝" w:cs="" w:cstheme="minorBidi" w:eastAsiaTheme="minorEastAsia"/>
+      <w:rFonts w:ascii="Courier" w:hAnsi="Courier" w:eastAsia="" w:cs="" w:cstheme="minorBidi" w:eastAsiaTheme="minorEastAsia"/>
       <w:color w:val="auto"/>
       <w:kern w:val="0"/>
       <w:sz w:val="20"/>
@@ -5296,7 +5554,6 @@
       <w:pPr>
         <w:spacing w:before="0" w:after="0" w:line="240" w:lineRule="auto"/>
       </w:pPr>
-      <w:rPr/>
       <w:tblPr/>
       <w:tcPr>
         <w:tcBorders>
@@ -5442,7 +5699,6 @@
       <w:pPr>
         <w:spacing w:before="0" w:after="0" w:line="240" w:lineRule="auto"/>
       </w:pPr>
-      <w:rPr/>
       <w:tblPr/>
       <w:tcPr>
         <w:tcBorders>
@@ -5588,7 +5844,6 @@
       <w:pPr>
         <w:spacing w:before="0" w:after="0" w:line="240" w:lineRule="auto"/>
       </w:pPr>
-      <w:rPr/>
       <w:tblPr/>
       <w:tcPr>
         <w:tcBorders>
@@ -5734,7 +5989,6 @@
       <w:pPr>
         <w:spacing w:before="0" w:after="0" w:line="240" w:lineRule="auto"/>
       </w:pPr>
-      <w:rPr/>
       <w:tblPr/>
       <w:tcPr>
         <w:tcBorders>
@@ -5880,7 +6134,6 @@
       <w:pPr>
         <w:spacing w:before="0" w:after="0" w:line="240" w:lineRule="auto"/>
       </w:pPr>
-      <w:rPr/>
       <w:tblPr/>
       <w:tcPr>
         <w:tcBorders>
@@ -6026,7 +6279,6 @@
       <w:pPr>
         <w:spacing w:before="0" w:after="0" w:line="240" w:lineRule="auto"/>
       </w:pPr>
-      <w:rPr/>
       <w:tblPr/>
       <w:tcPr>
         <w:tcBorders>
@@ -6172,7 +6424,6 @@
       <w:pPr>
         <w:spacing w:before="0" w:after="0" w:line="240" w:lineRule="auto"/>
       </w:pPr>
-      <w:rPr/>
       <w:tblPr/>
       <w:tcPr>
         <w:tcBorders>

</xml_diff>